<commit_message>
Deploy preview for PR 58 🛫
</commit_message>
<xml_diff>
--- a/pr-preview/pr-58/Your-Book-Title-tracked-changes.docx
+++ b/pr-preview/pr-58/Your-Book-Title-tracked-changes.docx
@@ -2232,7 +2232,7 @@
           <w:numId w:val="1004"/>
         </w:numPr>
       </w:pPr>
-      <w:ins w:id="79" w:author="d-morrison" w:date="2026-09-15T01:07:52Z">
+      <w:ins w:id="79" w:author="d-morrison" w:date="2026-09-15T01:09:47Z">
         <w:r>
           <w:rPr>
             <w:b/>
@@ -2241,12 +2241,12 @@
           <w:t xml:space="preserve">Branch:</w:t>
         </w:r>
       </w:ins>
-      <w:ins w:id="79" w:author="d-morrison" w:date="2026-09-15T01:07:52Z">
+      <w:ins w:id="79" w:author="d-morrison" w:date="2026-09-15T01:09:47Z">
         <w:r>
           <w:t xml:space="preserve"> </w:t>
         </w:r>
       </w:ins>
-      <w:ins w:id="79" w:author="d-morrison" w:date="2026-09-15T01:07:52Z">
+      <w:ins w:id="79" w:author="d-morrison" w:date="2026-09-15T01:09:47Z">
         <w:r>
           <w:t xml:space="preserve">claude/fix-28-workflow-timeouts</w:t>
         </w:r>
@@ -2260,7 +2260,7 @@
           <w:numId w:val="1004"/>
         </w:numPr>
       </w:pPr>
-      <w:ins w:id="80" w:author="d-morrison" w:date="2026-09-15T01:07:52Z">
+      <w:ins w:id="80" w:author="d-morrison" w:date="2026-09-15T01:09:47Z">
         <w:r>
           <w:rPr>
             <w:b/>
@@ -2269,14 +2269,14 @@
           <w:t xml:space="preserve">Commit:</w:t>
         </w:r>
       </w:ins>
-      <w:ins w:id="80" w:author="d-morrison" w:date="2026-09-15T01:07:52Z">
+      <w:ins w:id="80" w:author="d-morrison" w:date="2026-09-15T01:09:47Z">
         <w:r>
           <w:t xml:space="preserve"> </w:t>
         </w:r>
       </w:ins>
-      <w:ins w:id="80" w:author="d-morrison" w:date="2026-09-15T01:07:52Z">
+      <w:ins w:id="80" w:author="d-morrison" w:date="2026-09-15T01:09:47Z">
         <w:r>
-          <w:t xml:space="preserve">fbdcb50</w:t>
+          <w:t xml:space="preserve">6669f36</w:t>
         </w:r>
       </w:ins>
     </w:p>
@@ -2288,7 +2288,7 @@
           <w:numId w:val="1004"/>
         </w:numPr>
       </w:pPr>
-      <w:ins w:id="81" w:author="d-morrison" w:date="2026-09-15T01:07:52Z">
+      <w:ins w:id="81" w:author="d-morrison" w:date="2026-09-15T01:09:47Z">
         <w:r>
           <w:rPr>
             <w:b/>
@@ -2297,14 +2297,14 @@
           <w:t xml:space="preserve">Full commit hash:</w:t>
         </w:r>
       </w:ins>
-      <w:ins w:id="81" w:author="d-morrison" w:date="2026-09-15T01:07:52Z">
+      <w:ins w:id="81" w:author="d-morrison" w:date="2026-09-15T01:09:47Z">
         <w:r>
           <w:t xml:space="preserve"> </w:t>
         </w:r>
       </w:ins>
-      <w:ins w:id="81" w:author="d-morrison" w:date="2026-09-15T01:07:52Z">
+      <w:ins w:id="81" w:author="d-morrison" w:date="2026-09-15T01:09:47Z">
         <w:r>
-          <w:t xml:space="preserve">fbdcb50b1c74bee7040b273910a8b72909ba3101</w:t>
+          <w:t xml:space="preserve">6669f36f68606fad349eb40d8e283d3cde1a388a</w:t>
         </w:r>
       </w:ins>
     </w:p>
@@ -2316,7 +2316,7 @@
           <w:numId w:val="1004"/>
         </w:numPr>
       </w:pPr>
-      <w:ins w:id="82" w:author="d-morrison" w:date="2026-09-15T01:07:52Z">
+      <w:ins w:id="82" w:author="d-morrison" w:date="2026-09-15T01:09:47Z">
         <w:r>
           <w:rPr>
             <w:b/>
@@ -2325,14 +2325,14 @@
           <w:t xml:space="preserve">Commit date:</w:t>
         </w:r>
       </w:ins>
-      <w:ins w:id="82" w:author="d-morrison" w:date="2026-09-15T01:07:52Z">
+      <w:ins w:id="82" w:author="d-morrison" w:date="2026-09-15T01:09:47Z">
         <w:r>
           <w:t xml:space="preserve"> </w:t>
         </w:r>
       </w:ins>
-      <w:ins w:id="82" w:author="d-morrison" w:date="2026-09-15T01:07:52Z">
+      <w:ins w:id="82" w:author="d-morrison" w:date="2026-09-15T01:09:47Z">
         <w:r>
-          <w:t xml:space="preserve">2026-09-14 18:05:21 -0700</w:t>
+          <w:t xml:space="preserve">2026-09-15 01:07:19 +0000</w:t>
         </w:r>
       </w:ins>
     </w:p>

</xml_diff>